<commit_message>
Simplify Evaluations explainer: lead with plain-language 'what is this' before UI mechanics
User feedback from live rehearsal: the guide jumped straight into UI mechanics
(Configure button, Monitor settings dialog) without first explaining what the
Evaluations/Evaluator catalog/Red team tabs even are, leaving the narrative
thread unclear. Added a new 'Primero, lo simple' explainer at the top of the
Monitor Configure subsection (both .md and .docx) that plainly maps the 3
Evaluations tabs to a 'report card' analogy, grounded in the real
weekly-quality-monitor + invoice-audit-security-scan examples already in this
environment, before diving into the Configure button / Monitor settings
mechanics.

Co-authored-by: Copilot <223556219+Copilot@users.noreply.github.com>
</commit_message>
<xml_diff>
--- a/deliverables/Guion-Invoice-Audit-Agent-Capitulo2-con-imagenes.docx
+++ b/deliverables/Guion-Invoice-Audit-Agent-Capitulo2-con-imagenes.docx
@@ -2322,7 +2322,86 @@
       </w:r>
     </w:p>
     <w:p>
+      <w:pPr>
+        <w:pStyle w:val="Heading3"/>
+      </w:pPr>
+      <w:r>
+        <w:t>Primero, lo simple: ¿para qué sirve cada pestaña de "Evaluations"?</w:t>
+      </w:r>
+    </w:p>
+    <w:p>
       <w:pPr/>
+      <w:r>
+        <w:t>Antes de tocar nada, aclaremos el panorama -- dentro de Build -&gt; Evaluations hay 3 pestañas que parecen relacionadas pero son 3 cosas distintas:</w:t>
+      </w:r>
+    </w:p>
+    <w:p>
+      <w:pPr>
+        <w:pStyle w:val="ListParagraph"/>
+      </w:pPr>
+      <w:r>
+        <w:t>Evaluations: la lista de "boletas de notas" automáticas que ya existen para tu agente. Cada fila es una boleta distinta.</w:t>
+      </w:r>
+    </w:p>
+    <w:p>
+      <w:pPr>
+        <w:pStyle w:val="ListParagraph"/>
+      </w:pPr>
+      <w:r>
+        <w:t>Evaluator catalog: el catálogo de posibles criterios de nota disponibles (Violencia, Contenido sexual, Calidad de respuesta, etc.). No hace nada por sí solo -- es de donde se eligen los criterios al crear una boleta nueva.</w:t>
+      </w:r>
+    </w:p>
+    <w:p>
+      <w:pPr>
+        <w:pStyle w:val="ListParagraph"/>
+      </w:pPr>
+      <w:r>
+        <w:t>Red team (Preview): no es una boleta de notas -- es una prueba de ataque: en vez de revisar si las respuestas son buenas, intenta romper al agente a propósito (hacerlo decir algo que no debería).</w:t>
+      </w:r>
+    </w:p>
+    <w:p>
+      <w:pPr/>
+      <w:r>
+        <w:rPr>
+          <w:b/>
+        </w:rPr>
+        <w:t>Ejemplo concreto, con lo que ya armamos en este ambiente:</w:t>
+      </w:r>
+    </w:p>
+    <w:p>
+      <w:pPr>
+        <w:pStyle w:val="ListParagraph"/>
+      </w:pPr>
+      <w:r>
+        <w:t>La boleta weekly-quality-monitor (pestaña "Evaluations") revisa, cada semana y sola, si las respuestas del agente tienen violencia, contenido sexual, autolesión, discriminación, o simplemente son de mala calidad.</w:t>
+      </w:r>
+    </w:p>
+    <w:p>
+      <w:pPr>
+        <w:pStyle w:val="ListParagraph"/>
+      </w:pPr>
+      <w:r>
+        <w:t>Esos 5 criterios salieron del "Evaluator catalog" al momento de crear la boleta.</w:t>
+      </w:r>
+    </w:p>
+    <w:p>
+      <w:pPr>
+        <w:pStyle w:val="ListParagraph"/>
+      </w:pPr>
+      <w:r>
+        <w:t>invoice-audit-security-scan (pestaña "Red team") es harina de otro costal: ahí no se evalúan respuestas reales -- se ataca al agente para ver si cede.</w:t>
+      </w:r>
+    </w:p>
+    <w:p>
+      <w:pPr/>
+      <w:r>
+        <w:t>Con esto claro, ahora sí -- el "Configure" del que hablamos a continuación es un tercer lugar más: dentro del agente (Monitor -&gt; Overview), no dentro de "Evaluations". Es donde se activa el piloto automático -- que esa boleta de notas y ese escaneo de seguridad corran solos, sin que nadie los lance a mano.</w:t>
+      </w:r>
+    </w:p>
+    <w:p>
+      <w:pPr>
+        <w:pStyle w:val="Heading3"/>
+      </w:pPr>
       <w:r>
         <w:rPr>
           <w:b/>

</xml_diff>

<commit_message>
Repoint scheduled red teaming to the successful quick scan; close pending warning
Re-opened Monitor settings > Scheduled red teaming runs and repointed the
Monthly schedule from the cancelled red team (invoice-audit-security-scan)
to the one that completed successfully (invoice-audit-security-scan-quick /
redteam-run-m56b284i, 75%/3% ASR). Confirmed Enabled with the correct
reference. Updated both .md and .docx to mark this as resolved instead of a
pending warning.

Co-authored-by: Copilot <223556219+Copilot@users.noreply.github.com>
</commit_message>
<xml_diff>
--- a/deliverables/Guion-Invoice-Audit-Agent-Capitulo2-con-imagenes.docx
+++ b/deliverables/Guion-Invoice-Audit-Agent-Capitulo2-con-imagenes.docx
@@ -2595,9 +2595,9 @@
       <w:r>
         <w:rPr>
           <w:b/>
-          <w:i/>
-        </w:rPr>
-        <w:t>Pendiente: la programación mensual configurada apunta todavía al red team cancelado -- hay que repuntarla a invoice-audit-security-scan-quick antes de la demo final.</w:t>
+          <w:i w:val="0"/>
+        </w:rPr>
+        <w:t>Cerrado: la programación mensual quedó repuntada a invoice-audit-security-scan-quick / redteam-run-m56b284i (el red team liviano, completado con éxito -- 75%/3% ASR) en vez del red team original que se canceló. Confirmado reabriendo el diálogo: "Scheduled red teaming runs" = Enabled, apuntando al red team correcto.</w:t>
       </w:r>
     </w:p>
     <w:p>

</xml_diff>